<commit_message>
Restore sample code and G-code links
</commit_message>
<xml_diff>
--- a/docs/OrcaSlicer_Offline_USB_3D_Printing_Guide.docx
+++ b/docs/OrcaSlicer_Offline_USB_3D_Printing_Guide.docx
@@ -6982,7 +6982,7 @@
             <w:u w:val="single"/>
             <w:sz w:val="19"/>
           </w:rPr>
-          <w:t>Reference K2 Pro G-code — inspection only; do not print</w:t>
+          <w:t>Sample parametric geometry notebook</w:t>
         </w:r>
       </w:hyperlink>
     </w:p>
@@ -7002,6 +7002,26 @@
             <w:u w:val="single"/>
             <w:sz w:val="19"/>
           </w:rPr>
+          <w:t>Reference K2 Pro G-code — inspection only; do not print</w:t>
+        </w:r>
+      </w:hyperlink>
+    </w:p>
+    <w:p>
+      <w:pPr>
+        <w:numPr>
+          <w:ilvl w:val="0"/>
+          <w:numId w:val="20"/>
+        </w:numPr>
+        <w:pStyle w:val="SmallText"/>
+      </w:pPr>
+      <w:hyperlink r:id="rId19">
+        <w:r>
+          <w:rPr>
+            <w:rFonts w:ascii="Times New Roman" w:hAnsi="Times New Roman" w:eastAsia="Times New Roman" w:cs="Times New Roman"/>
+            <w:color w:val="000000"/>
+            <w:u w:val="single"/>
+            <w:sz w:val="19"/>
+          </w:rPr>
           <w:t>Creality K2 Series product information</w:t>
         </w:r>
       </w:hyperlink>
@@ -7014,7 +7034,7 @@
         </w:numPr>
         <w:pStyle w:val="SmallText"/>
       </w:pPr>
-      <w:hyperlink r:id="rId19">
+      <w:hyperlink r:id="rId20">
         <w:r>
           <w:rPr>
             <w:rFonts w:ascii="Times New Roman" w:hAnsi="Times New Roman" w:eastAsia="Times New Roman" w:cs="Times New Roman"/>

</xml_diff>

<commit_message>
Clarify OrcaSlicer Preview inspection
</commit_message>
<xml_diff>
--- a/docs/OrcaSlicer_Offline_USB_3D_Printing_Guide.docx
+++ b/docs/OrcaSlicer_Offline_USB_3D_Printing_Guide.docx
@@ -2268,7 +2268,17 @@
           <w:color w:val="000000"/>
           <w:sz w:val="21"/>
         </w:rPr>
-        <w:t>Click Slice plate, open Preview, and move the layer slider from the first layer to the top. Look for a complete first layer, continuous closed loops, intended internal features, supported islands, accessible supports, reasonable travel moves, and no missing thin features. Review estimated material use and time, then save the complete OrcaSlicer project as .3mf.</w:t>
+        <w:t>Prepare shows the imported model; Preview shows the toolpaths the printer will actually attempt to deposit. A feature can look correct in CAD and still disappear after slicing if it is too thin for the selected nozzle and process profile, outside the build area, intersecting another body incorrectly, or unsupported. Only features visible as toolpaths in Preview can be printed.</w:t>
+      </w:r>
+    </w:p>
+    <w:p>
+      <w:r>
+        <w:rPr>
+          <w:rFonts w:ascii="Times New Roman" w:hAnsi="Times New Roman" w:eastAsia="Times New Roman" w:cs="Times New Roman"/>
+          <w:color w:val="000000"/>
+          <w:sz w:val="21"/>
+        </w:rPr>
+        <w:t>Click Slice plate, open Preview, and move the layer slider through the entire print. Check the first layer for continuous bed contact and no detached islands; check middle layers for complete walls, holes, internal features, supports, and infill; and check final layers for closed top surfaces and features that do not end early. If required geometry is missing, correct the model or validated slicer profile before exporting G-code.</w:t>
       </w:r>
     </w:p>
     <w:p>
@@ -2283,7 +2293,7 @@
         </w:rPr>
         <w:drawing>
           <wp:inline xmlns:a="http://schemas.openxmlformats.org/drawingml/2006/main" xmlns:pic="http://schemas.openxmlformats.org/drawingml/2006/picture">
-            <wp:extent cx="3246120" cy="1897409"/>
+            <wp:extent cx="5349240" cy="3056709"/>
             <wp:docPr id="1" name="Picture 1" title="OrcaSlicer-compatible layer preview" descr="Grayscale slicer screenshot showing a sample part, visible layer paths, and the material estimate."/>
             <wp:cNvGraphicFramePr>
               <a:graphicFrameLocks noChangeAspect="1"/>
@@ -2292,7 +2302,7 @@
               <a:graphicData uri="http://schemas.openxmlformats.org/drawingml/2006/picture">
                 <pic:pic>
                   <pic:nvPicPr>
-                    <pic:cNvPr id="0" name="image.png"/>
+                    <pic:cNvPr id="0" name="orcaslicer-preview-explained.png"/>
                     <pic:cNvPicPr/>
                   </pic:nvPicPr>
                   <pic:blipFill>
@@ -2304,7 +2314,7 @@
                   <pic:spPr>
                     <a:xfrm>
                       <a:off x="0" y="0"/>
-                      <a:ext cx="3246120" cy="1897409"/>
+                      <a:ext cx="5349240" cy="3056709"/>
                     </a:xfrm>
                     <a:prstGeom prst="rect"/>
                   </pic:spPr>
@@ -2325,7 +2335,19 @@
           <w:rFonts w:ascii="Times New Roman" w:hAnsi="Times New Roman" w:eastAsia="Times New Roman" w:cs="Times New Roman"/>
           <w:color w:val="000000"/>
         </w:rPr>
-        <w:t>Figure 1. OrcaSlicer-compatible layer-preview example with light infill. Visible toolpaths and estimates are part of the pre-print check. Interface labels may vary by version; do not copy example settings without validation.</w:t>
+        <w:t>Figure 1. How to read Preview. Blue paths are closed perimeters; orange paths are sparse infill. Infill changes the interior but cannot repair a missing perimeter. Inspect first, middle, and final layers, and use only a validated printer, nozzle, material, and process profile.</w:t>
+      </w:r>
+    </w:p>
+    <w:p>
+      <w:pPr>
+        <w:spacing w:after="0"/>
+      </w:pPr>
+      <w:r>
+        <w:rPr>
+          <w:rFonts w:ascii="Times New Roman" w:hAnsi="Times New Roman" w:eastAsia="Times New Roman" w:cs="Times New Roman"/>
+          <w:color w:val="000000"/>
+        </w:rPr>
+        <w:br w:type="page"/>
       </w:r>
     </w:p>
     <w:p>

</xml_diff>